<commit_message>
feat(resume): add ten technology strings to Core Expertise and every mirror
DuckDB, Parquet, dlt, DuckLake, Claude API, LLM Observability & Evaluation,
AWS, Docker, Supabase and Cloudflare land in both résumé YAML grids (eng_music
folds them into its existing two groups — it has no Data group by design), the
two hire/ expertise matrices, and both recruiter briefs (markdown + page) as a
sentence on the Wolfpack founder proof point; the four downloads are rebuilt.
Résumé version stays 2.4.

Refs #304

Co-Authored-By: Claude Opus 5 (1M context) <noreply@anthropic.com>
</commit_message>
<xml_diff>
--- a/hire/assets/dl/Ryan-Hickey-Resume-Music.docx
+++ b/hire/assets/dl/Ryan-Hickey-Resume-Music.docx
@@ -111,7 +111,7 @@
               <w:pStyle w:val="WPSkillList"/>
             </w:pPr>
             <w:r>
-              <w:t>Prompt Engineering · Claude Code · Claude Skills &amp; Subagents · OpenAI Codex · ChatGPT · GitHub Copilot · Model Context Protocol (MCP) · AI Agent Design · Multi-Agent Orchestration · Workflow Automation</w:t>
+              <w:t>Prompt Engineering · Claude Code · Claude Skills &amp; Subagents · OpenAI Codex · ChatGPT · GitHub Copilot · Model Context Protocol (MCP) · AI Agent Design · Multi-Agent Orchestration · Workflow Automation · Claude API · LLM Observability &amp; Evaluation</w:t>
             </w:r>
           </w:p>
         </w:tc>
@@ -132,7 +132,7 @@
               <w:pStyle w:val="WPSkillList"/>
             </w:pPr>
             <w:r>
-              <w:t>Python · SQL · dbt · BigQuery · PostgreSQL · VBA &amp; Advanced Excel · Data Architecture · GitHub Actions &amp; GitFlow · CI/CD · Systems Design</w:t>
+              <w:t>Python · SQL · dbt · BigQuery · PostgreSQL · VBA &amp; Advanced Excel · Data Architecture · GitHub Actions &amp; GitFlow · CI/CD · Systems Design · DuckDB · Parquet · dlt · DuckLake · AWS · Docker · Supabase · Cloudflare</w:t>
             </w:r>
           </w:p>
         </w:tc>

</xml_diff>

<commit_message>
feat(resume): add ten technology strings to Core Expertise and every mirror (#305)
DuckDB, Parquet, dlt, DuckLake, Claude API, LLM Observability & Evaluation,
AWS, Docker, Supabase and Cloudflare land in both résumé YAML grids (eng_music
folds them into its existing two groups — it has no Data group by design), the
two hire/ expertise matrices, and both recruiter briefs (markdown + page) as a
sentence on the Wolfpack founder proof point; the four downloads are rebuilt.
Résumé version stays 2.4.

Refs #304

Co-authored-by: Claude Opus 5 (1M context) <noreply@anthropic.com>
</commit_message>
<xml_diff>
--- a/hire/assets/dl/Ryan-Hickey-Resume-Music.docx
+++ b/hire/assets/dl/Ryan-Hickey-Resume-Music.docx
@@ -111,7 +111,7 @@
               <w:pStyle w:val="WPSkillList"/>
             </w:pPr>
             <w:r>
-              <w:t>Prompt Engineering · Claude Code · Claude Skills &amp; Subagents · OpenAI Codex · ChatGPT · GitHub Copilot · Model Context Protocol (MCP) · AI Agent Design · Multi-Agent Orchestration · Workflow Automation</w:t>
+              <w:t>Prompt Engineering · Claude Code · Claude Skills &amp; Subagents · OpenAI Codex · ChatGPT · GitHub Copilot · Model Context Protocol (MCP) · AI Agent Design · Multi-Agent Orchestration · Workflow Automation · Claude API · LLM Observability &amp; Evaluation</w:t>
             </w:r>
           </w:p>
         </w:tc>
@@ -132,7 +132,7 @@
               <w:pStyle w:val="WPSkillList"/>
             </w:pPr>
             <w:r>
-              <w:t>Python · SQL · dbt · BigQuery · PostgreSQL · VBA &amp; Advanced Excel · Data Architecture · GitHub Actions &amp; GitFlow · CI/CD · Systems Design</w:t>
+              <w:t>Python · SQL · dbt · BigQuery · PostgreSQL · VBA &amp; Advanced Excel · Data Architecture · GitHub Actions &amp; GitFlow · CI/CD · Systems Design · DuckDB · Parquet · dlt · DuckLake · AWS · Docker · Supabase · Cloudflare</w:t>
             </w:r>
           </w:p>
         </w:tc>

</xml_diff>